<commit_message>
Clarify solver step counters and historical dynamics figure
</commit_message>
<xml_diff>
--- a/manuscript/transfer_article.docx
+++ b/manuscript/transfer_article.docx
@@ -9955,13 +9955,7 @@
         </m:r>
       </m:oMath>
       <w:r>
-        <w:t xml:space="preserve">. For the fixed overturning-state startup and its</w:t>
-      </w:r>
-      <w:r>
-        <w:t xml:space="preserve"> </w:t>
-      </w:r>
-      <w:r>
-        <w:t xml:space="preserve">time-step checks in Appendix A, the controls are CFL</w:t>
+        <w:t xml:space="preserve">. For the fixed overturning-state startup, the baseline controls are CFL</w:t>
       </w:r>
       <w:r>
         <w:t xml:space="preserve"> </w:t>
@@ -10002,7 +9996,13 @@
         </m:sSup>
       </m:oMath>
       <w:r>
-        <w:t xml:space="preserve">. The main smooth-wave</w:t>
+        <w:t xml:space="preserve">; the time-step variations</w:t>
+      </w:r>
+      <w:r>
+        <w:t xml:space="preserve"> </w:t>
+      </w:r>
+      <w:r>
+        <w:t xml:space="preserve">are specified in Appendix A.9. The main smooth-wave</w:t>
       </w:r>
       <w:r>
         <w:t xml:space="preserve"> </w:t>
@@ -33263,13 +33263,60 @@
         <w:t xml:space="preserve"> </w:t>
       </w:r>
       <w:r>
-        <w:t xml:space="preserve">a 4.27-fold reduction. Recorded step counts are 210 and 420, with observed</w:t>
-      </w:r>
-      <w:r>
-        <w:t xml:space="preserve"> </w:t>
-      </w:r>
-      <w:r>
-        <w:t xml:space="preserve">maximal steps 0.0025 and 0.00125. The corresponding unrefined-trace</w:t>
+        <w:t xml:space="preserve">a 4.27-fold reduction. The logs record final zero-based step indices</w:t>
+      </w:r>
+      <w:r>
+        <w:t xml:space="preserve"> </w:t>
+      </w:r>
+      <w:r>
+        <w:t xml:space="preserve">210 and 420: 211 and 421 time advances, respectively. Each run takes</w:t>
+      </w:r>
+      <w:r>
+        <w:t xml:space="preserve"> </w:t>
+      </w:r>
+      <w:r>
+        <w:t xml:space="preserve">210 or 420 full steps of 0.0025 or 0.00125, followed by a shortened</w:t>
+      </w:r>
+      <w:r>
+        <w:t xml:space="preserve"> </w:t>
+      </w:r>
+      <w:r>
+        <w:t xml:space="preserve">final step of approximately</w:t>
+      </w:r>
+      <w:r>
+        <w:t xml:space="preserve"> </w:t>
+      </w:r>
+      <m:oMath>
+        <m:r>
+          <m:t>7.18</m:t>
+        </m:r>
+        <m:r>
+          <m:rPr>
+            <m:sty m:val="p"/>
+          </m:rPr>
+          <m:t>×</m:t>
+        </m:r>
+        <m:sSup>
+          <m:e>
+            <m:r>
+              <m:t>10</m:t>
+            </m:r>
+          </m:e>
+          <m:sup>
+            <m:r>
+              <m:rPr>
+                <m:sty m:val="p"/>
+              </m:rPr>
+              <m:t>−</m:t>
+            </m:r>
+            <m:r>
+              <m:t>5</m:t>
+            </m:r>
+          </m:sup>
+        </m:sSup>
+      </m:oMath>
+      <w:r>
+        <w:t xml:space="preserve">. The corresponding unrefined-trace</w:t>
       </w:r>
       <w:r>
         <w:t xml:space="preserve"> </w:t>
@@ -34504,7 +34551,7 @@
         <w:t xml:space="preserve"> </w:t>
       </w:r>
       <w:r>
-        <w:t xml:space="preserve">All three branches complete 210 steps; maximum recorded post-start</w:t>
+        <w:t xml:space="preserve">All three branches complete 211 time advances (final step index 210); maximum recorded post-start</w:t>
       </w:r>
       <w:r>
         <w:t xml:space="preserve"> </w:t>
@@ -36133,7 +36180,7 @@
         <w:t xml:space="preserve"> </w:t>
       </w:r>
       <w:r>
-        <w:t xml:space="preserve">in 210 steps. The receiver reconstructs runtime face fluxes from</w:t>
+        <w:t xml:space="preserve">after 211 time advances (final step index 210). The receiver reconstructs runtime face fluxes from</w:t>
       </w:r>
       <w:r>
         <w:t xml:space="preserve"> </w:t>
@@ -36145,13 +36192,19 @@
         <w:t xml:space="preserve"> </w:t>
       </w:r>
       <w:r>
-        <w:t xml:space="preserve">three-grid series in Section 6.2; their main value here</w:t>
+        <w:t xml:space="preserve">three-grid series in Sections 6.2 and 7.2; their main value here</w:t>
       </w:r>
       <w:r>
         <w:t xml:space="preserve"> </w:t>
       </w:r>
       <w:r>
         <w:t xml:space="preserve">is the historical time-step control below.</w:t>
+      </w:r>
+      <w:r>
+        <w:t xml:space="preserve"> </w:t>
+      </w:r>
+      <w:r>
+        <w:t xml:space="preserve">Figure 6 shows these earlier trajectories.</w:t>
       </w:r>
     </w:p>
     <w:p>
@@ -36414,7 +36467,13 @@
         <w:t xml:space="preserve"> </w:t>
       </w:r>
       <w:r>
-        <w:t xml:space="preserve">The matched run completes 420 steps and gives velocity error</w:t>
+        <w:t xml:space="preserve">The matched run completes 421 time advances (final step index 420)</w:t>
+      </w:r>
+      <w:r>
+        <w:t xml:space="preserve"> </w:t>
+      </w:r>
+      <w:r>
+        <w:t xml:space="preserve">and gives velocity error</w:t>
       </w:r>
       <w:r>
         <w:t xml:space="preserve"> </w:t>
@@ -38483,13 +38542,13 @@
         <w:widowControl/>
       </w:pPr>
       <w:r>
-        <w:t xml:space="preserve">Fig. 6 Propagation of transfer error with Matched (M)</w:t>
-      </w:r>
-      <w:r>
-        <w:t xml:space="preserve"> </w:t>
-      </w:r>
-      <w:r>
-        <w:t xml:space="preserve">and Bilinear (B) initialisations. L9 and L10 denote</w:t>
+        <w:t xml:space="preserve">Fig. 6 Propagation of transfer error on the original receiver build</w:t>
+      </w:r>
+      <w:r>
+        <w:t xml:space="preserve"> </w:t>
+      </w:r>
+      <w:r>
+        <w:t xml:space="preserve">with Matched (M) and Bilinear (B) initialisations. L9 and L10 denote</w:t>
       </w:r>
       <w:r>
         <w:t xml:space="preserve"> </w:t>

</xml_diff>